<commit_message>
docs: manual de usuario V.I.S.O.R., notas de la 0.5.0-beta y documentación en Word actualizada
El manual (Word y PDF, 15 páginas) usa la hoja membretada del manual de identidad
y capturas reales de un Galaxy A30. La documentación en Word incorpora el inicio
de sesión, la identidad V.I.S.O.R., el retiro del mapa 2D y R8.

Co-Authored-By: Claude Sonnet 5.5 <noreply@anthropic.com>
Claude-Session: https://claude.ai/code/session_01LnARoji92KcvXKoGYF2Hfj
</commit_message>
<xml_diff>
--- a/docs/Documentacion-Proyecto-Robot-Centinela.docx
+++ b/docs/Documentacion-Proyecto-Robot-Centinela.docx
@@ -51,7 +51,7 @@
           <w:color w:val="1F3A8A"/>
           <w:sz w:val="76"/>
         </w:rPr>
-        <w:t>Robot Centinela</w:t>
+        <w:t>V.I.S.O.R.</w:t>
       </w:r>
     </w:p>
     <w:p>
@@ -64,9 +64,9 @@
           <w:b w:val="0"/>
           <w:i w:val="0"/>
           <w:color w:val="1F3A8A"/>
-          <w:sz w:val="44"/>
+          <w:sz w:val="40"/>
         </w:rPr>
-        <w:t>Aplicación móvil (Android)</w:t>
+        <w:t>Aplicación móvil (Android) · Robot Centinela</w:t>
       </w:r>
     </w:p>
     <w:p>
@@ -150,7 +150,7 @@
                 <w:i w:val="0"/>
                 <w:sz w:val="20"/>
               </w:rPr>
-              <w:t>0.3.0-beta (demostración beta)</w:t>
+              <w:t>0.5.0-beta (beta: versión con inicio de sesión y versión de demostración)</w:t>
             </w:r>
           </w:p>
         </w:tc>
@@ -193,7 +193,7 @@
                 <w:i w:val="0"/>
                 <w:sz w:val="20"/>
               </w:rPr>
-              <w:t>2026-10-29</w:t>
+              <w:t>2026-10-31</w:t>
             </w:r>
           </w:p>
         </w:tc>
@@ -929,7 +929,7 @@
                 <w:i w:val="0"/>
                 <w:sz w:val="18"/>
               </w:rPr>
-              <w:t>Implementada según los mockups: Resumen, Mapa, Misiones, Historial, Eventos</w:t>
+              <w:t>Implementada según los mockups: Resumen, Mapa, Misiones, Historial, Eventos y Ajustes</w:t>
             </w:r>
           </w:p>
         </w:tc>
@@ -954,7 +954,7 @@
                 <w:i w:val="0"/>
                 <w:sz w:val="18"/>
               </w:rPr>
-              <w:t>Conexión con Supabase</w:t>
+              <w:t>Identidad visual V.I.S.O.R.</w:t>
             </w:r>
           </w:p>
         </w:tc>
@@ -974,7 +974,7 @@
                 <w:i w:val="0"/>
                 <w:sz w:val="18"/>
               </w:rPr>
-              <w:t>Funciona contra el proyecto real; pendiente comprobar con un usuario con membresía</w:t>
+              <w:t>Aplicada (ADR-008): isotipo, ícono, bienvenida, paleta, Questrial y Poppins, íconos de la marca</w:t>
             </w:r>
           </w:p>
         </w:tc>
@@ -998,7 +998,7 @@
                 <w:i w:val="0"/>
                 <w:sz w:val="18"/>
               </w:rPr>
-              <w:t>Inicio de sesión</w:t>
+              <w:t>Conexión con Supabase</w:t>
             </w:r>
           </w:p>
         </w:tc>
@@ -1017,7 +1017,7 @@
                 <w:i w:val="0"/>
                 <w:sz w:val="18"/>
               </w:rPr>
-              <w:t>Pendiente (va al final, por indicación del equipo)</w:t>
+              <w:t>Funciona contra el proyecto real; pendiente comprobar con un usuario con membresía</w:t>
             </w:r>
           </w:p>
         </w:tc>
@@ -1042,7 +1042,7 @@
                 <w:i w:val="0"/>
                 <w:sz w:val="18"/>
               </w:rPr>
-              <w:t>Demostración beta</w:t>
+              <w:t>Inicio de sesión</w:t>
             </w:r>
           </w:p>
         </w:tc>
@@ -1062,23 +1062,7 @@
                 <w:i w:val="0"/>
                 <w:sz w:val="18"/>
               </w:rPr>
-              <w:t xml:space="preserve">APK </w:t>
-            </w:r>
-            <w:r>
-              <w:rPr>
-                <w:rFonts w:ascii="Consolas" w:hAnsi="Consolas" w:eastAsia="Consolas"/>
-                <w:i w:val="0"/>
-                <w:sz w:val="16"/>
-              </w:rPr>
-              <w:t>demo</w:t>
-            </w:r>
-            <w:r>
-              <w:rPr>
-                <w:b w:val="0"/>
-                <w:i w:val="0"/>
-                <w:sz w:val="18"/>
-              </w:rPr>
-              <w:t xml:space="preserve"> 0.3.0-beta: lectura pública, sin inicio de sesión (temporal)</w:t>
+              <w:t>Implementado (ADR-006): correo y contraseña, recuperación de acceso y cierre de sesión; sin usuario con membresía no hay datos (B21)</w:t>
             </w:r>
           </w:p>
         </w:tc>
@@ -1102,7 +1086,111 @@
                 <w:i w:val="0"/>
                 <w:sz w:val="18"/>
               </w:rPr>
-              <w:t>Mapas, calibraciones, CSV, push, video, comandos</w:t>
+              <w:t>Demostración beta</w:t>
+            </w:r>
+          </w:p>
+        </w:tc>
+        <w:tc>
+          <w:tcPr>
+            <w:tcW w:type="dxa" w:w="5953"/>
+          </w:tcPr>
+          <w:p>
+            <w:pPr>
+              <w:spacing w:after="0"/>
+            </w:pPr>
+            <w:r/>
+            <w:r>
+              <w:rPr>
+                <w:b w:val="0"/>
+                <w:i w:val="0"/>
+                <w:sz w:val="18"/>
+              </w:rPr>
+              <w:t xml:space="preserve">APK </w:t>
+            </w:r>
+            <w:r>
+              <w:rPr>
+                <w:rFonts w:ascii="Consolas" w:hAnsi="Consolas" w:eastAsia="Consolas"/>
+                <w:i w:val="0"/>
+                <w:sz w:val="16"/>
+              </w:rPr>
+              <w:t>demo</w:t>
+            </w:r>
+            <w:r>
+              <w:rPr>
+                <w:b w:val="0"/>
+                <w:i w:val="0"/>
+                <w:sz w:val="18"/>
+              </w:rPr>
+              <w:t xml:space="preserve"> 0.5.0-beta: lectura pública, sin inicio de sesión (temporal, ADR-007)</w:t>
+            </w:r>
+          </w:p>
+        </w:tc>
+      </w:tr>
+      <w:tr>
+        <w:trPr>
+          <w:cantSplit w:val="true"/>
+        </w:trPr>
+        <w:tc>
+          <w:tcPr>
+            <w:tcW w:type="dxa" w:w="3685"/>
+            <w:shd w:val="clear" w:color="auto" w:fill="EEF2FF"/>
+          </w:tcPr>
+          <w:p>
+            <w:pPr>
+              <w:spacing w:after="0"/>
+            </w:pPr>
+            <w:r/>
+            <w:r>
+              <w:rPr>
+                <w:b w:val="0"/>
+                <w:i w:val="0"/>
+                <w:sz w:val="18"/>
+              </w:rPr>
+              <w:t>Mapa asistido 2D</w:t>
+            </w:r>
+          </w:p>
+        </w:tc>
+        <w:tc>
+          <w:tcPr>
+            <w:tcW w:type="dxa" w:w="5953"/>
+            <w:shd w:val="clear" w:color="auto" w:fill="EEF2FF"/>
+          </w:tcPr>
+          <w:p>
+            <w:pPr>
+              <w:spacing w:after="0"/>
+            </w:pPr>
+            <w:r/>
+            <w:r>
+              <w:rPr>
+                <w:b w:val="0"/>
+                <w:i w:val="0"/>
+                <w:sz w:val="18"/>
+              </w:rPr>
+              <w:t>No disponible · Implementación futura (ADR-009); lo implementará el equipo de IoT</w:t>
+            </w:r>
+          </w:p>
+        </w:tc>
+      </w:tr>
+      <w:tr>
+        <w:trPr>
+          <w:cantSplit w:val="true"/>
+        </w:trPr>
+        <w:tc>
+          <w:tcPr>
+            <w:tcW w:type="dxa" w:w="3685"/>
+          </w:tcPr>
+          <w:p>
+            <w:pPr>
+              <w:spacing w:after="0"/>
+            </w:pPr>
+            <w:r/>
+            <w:r>
+              <w:rPr>
+                <w:b w:val="0"/>
+                <w:i w:val="0"/>
+                <w:sz w:val="18"/>
+              </w:rPr>
+              <w:t>Calibraciones, CSV, push, video, comandos</w:t>
             </w:r>
           </w:p>
         </w:tc>
@@ -1273,7 +1361,7 @@
                 <w:i w:val="0"/>
                 <w:sz w:val="18"/>
               </w:rPr>
-              <w:t>Inicio y cierre de sesión con Supabase Auth, y selección explícita del domicilio</w:t>
+              <w:t>Inicio y cierre de sesión con Supabase Auth, recuperación de acceso y selección explícita del domicilio</w:t>
             </w:r>
           </w:p>
         </w:tc>
@@ -1292,7 +1380,7 @@
                 <w:i w:val="0"/>
                 <w:sz w:val="18"/>
               </w:rPr>
-              <w:t>HU01</w:t>
+              <w:t>HU01, RF01, RF02</w:t>
             </w:r>
           </w:p>
         </w:tc>
@@ -1537,7 +1625,7 @@
                 <w:i w:val="0"/>
                 <w:sz w:val="18"/>
               </w:rPr>
-              <w:t>Pose con incertidumbre e IDs de mapa y misión (sin geometría de mapa)</w:t>
+              <w:t>Pose con incertidumbre e IDs de mapa y misión en el dominio; el mapa 2D no se incluye en esta versión</w:t>
             </w:r>
           </w:p>
         </w:tc>
@@ -1556,7 +1644,7 @@
                 <w:i w:val="0"/>
                 <w:sz w:val="18"/>
               </w:rPr>
-              <w:t>HU05, HU06 (parcial)</w:t>
+              <w:t>HU05, HU06 (futuro)</w:t>
             </w:r>
           </w:p>
         </w:tc>
@@ -1625,7 +1713,7 @@
                 <w:i w:val="0"/>
                 <w:sz w:val="18"/>
               </w:rPr>
-              <w:t>Interfaz Compose según los mockups móviles: Resumen, Mapa, Misiones e Historial (Eventos desde la campana), con tema claro/oscuro</w:t>
+              <w:t>Interfaz Compose según los mockups móviles: Pantalla de Login, Resumen, Mapa, Misiones, Historial, Eventos y Ajustes con tema claro/oscuro, Poppins y Questrial</w:t>
             </w:r>
           </w:p>
         </w:tc>
@@ -1644,7 +1732,7 @@
                 <w:i w:val="0"/>
                 <w:sz w:val="18"/>
               </w:rPr>
-              <w:t>HU02 a HU08, HU12, HU20</w:t>
+              <w:t>HU01 a HU08, HU12, HU20</w:t>
             </w:r>
           </w:p>
         </w:tc>
@@ -1669,7 +1757,7 @@
                 <w:i w:val="0"/>
                 <w:sz w:val="18"/>
               </w:rPr>
-              <w:t>Plano por versión de mapa y resumen de misión: contratos provisionales en :core, sin adaptador todavía (la interfaz muestra "pendiente de backend")</w:t>
+              <w:t>Resumen de misión (contrato provisional en :core); el mapa 2D muestra "No disponible / Implementación futura"</w:t>
             </w:r>
           </w:p>
         </w:tc>
@@ -1689,7 +1777,7 @@
                 <w:i w:val="0"/>
                 <w:sz w:val="18"/>
               </w:rPr>
-              <w:t>HU05, HU06, HU08</w:t>
+              <w:t>HU06, HU08</w:t>
             </w:r>
           </w:p>
         </w:tc>
@@ -1755,35 +1843,7 @@
           <w:b w:val="0"/>
           <w:i w:val="0"/>
         </w:rPr>
-        <w:t>Geometría del plano, habitaciones y estaciones (el contrato de mapas no está publicado).</w:t>
-      </w:r>
-    </w:p>
-    <w:p>
-      <w:pPr>
-        <w:pStyle w:val="ListBullet"/>
-        <w:spacing w:after="40"/>
-      </w:pPr>
-      <w:r>
-        <w:rPr>
-          <w:b w:val="0"/>
-          <w:i w:val="0"/>
-        </w:rPr>
-        <w:t xml:space="preserve">Pantalla de inicio de sesión y recuperación de acceso (los casos de uso existen en </w:t>
-      </w:r>
-      <w:r>
-        <w:rPr>
-          <w:rFonts w:ascii="Consolas" w:hAnsi="Consolas" w:eastAsia="Consolas"/>
-          <w:i w:val="0"/>
-          <w:sz w:val="19"/>
-        </w:rPr>
-        <w:t>:core</w:t>
-      </w:r>
-      <w:r>
-        <w:rPr>
-          <w:b w:val="0"/>
-          <w:i w:val="0"/>
-        </w:rPr>
-        <w:t>).</w:t>
+        <w:t>Mapa asistido 2D: plano, posición, ruta, habitaciones y lecturas por habitación (implementación futura, equipo de IoT; ADR-009).</w:t>
       </w:r>
     </w:p>
     <w:p>
@@ -2937,7 +2997,7 @@
                 <w:i w:val="0"/>
                 <w:sz w:val="17"/>
               </w:rPr>
-              <w:t>Pose e ID de versión de mapa (RF12). La geometría está pendiente</w:t>
+              <w:t>Pose e ID de versión de mapa (RF12). El mapa 2D no se incluye en esta versión (ADR-009)</w:t>
             </w:r>
           </w:p>
         </w:tc>
@@ -7563,7 +7623,7 @@
           <w:b w:val="0"/>
           <w:i w:val="0"/>
         </w:rPr>
-        <w:t>. Se basa en los mockups del equipo de diseño y en la guía *Lunar Base*.</w:t>
+        <w:t>. Se basa en los mockups del equipo de diseño y en la guía de interfaces y la identidad V.I.S.O.R. del Manual de identidad corporativa (ADR-008).</w:t>
       </w:r>
     </w:p>
     <w:p>
@@ -7675,7 +7735,7 @@
                 <w:i w:val="0"/>
                 <w:sz w:val="17"/>
               </w:rPr>
-              <w:t>Elegir domicilio</w:t>
+              <w:t>Iniciar sesión</w:t>
             </w:r>
           </w:p>
         </w:tc>
@@ -7694,7 +7754,7 @@
                 <w:i w:val="0"/>
                 <w:sz w:val="17"/>
               </w:rPr>
-              <w:t>Domicilios visibles y su zona horaria</w:t>
+              <w:t>Entrada con correo y contraseña, recuperación de acceso y soporte de cuenta de prueba</w:t>
             </w:r>
           </w:p>
         </w:tc>
@@ -7713,7 +7773,7 @@
                 <w:i w:val="0"/>
                 <w:sz w:val="17"/>
               </w:rPr>
-              <w:t>Supabase: memberships, homes, robots</w:t>
+              <w:t>Supabase Auth (SignIn, RecoverAccess)</w:t>
             </w:r>
           </w:p>
         </w:tc>
@@ -7738,7 +7798,7 @@
                 <w:i w:val="0"/>
                 <w:sz w:val="17"/>
               </w:rPr>
-              <w:t>Resumen</w:t>
+              <w:t>Elegir domicilio</w:t>
             </w:r>
           </w:p>
         </w:tc>
@@ -7758,7 +7818,7 @@
                 <w:i w:val="0"/>
                 <w:sz w:val="17"/>
               </w:rPr>
-              <w:t>Gas LP, metano, temperatura y humedad (valor, unidad, "Última lectura", calidad); Operación (batería y estaciones); mapa; Eventos y Avisos</w:t>
+              <w:t>Domicilios visibles y su zona horaria</w:t>
             </w:r>
           </w:p>
         </w:tc>
@@ -7778,7 +7838,7 @@
                 <w:i w:val="0"/>
                 <w:sz w:val="17"/>
               </w:rPr>
-              <w:t>Telemetría en vivo (telemetry_frames y sus tablas hijas, deltas por stream_version + Realtime), unidades de channels y alertas</w:t>
+              <w:t>Supabase: memberships, homes, robots</w:t>
             </w:r>
           </w:p>
         </w:tc>
@@ -7802,7 +7862,7 @@
                 <w:i w:val="0"/>
                 <w:sz w:val="17"/>
               </w:rPr>
-              <w:t>Mapa</w:t>
+              <w:t>Resumen</w:t>
             </w:r>
           </w:p>
         </w:tc>
@@ -7821,7 +7881,7 @@
                 <w:i w:val="0"/>
                 <w:sz w:val="17"/>
               </w:rPr>
-              <w:t>Misión en curso, estaciones, sensores, batería, mapa con pose e incertidumbre, habitaciones</w:t>
+              <w:t>Gas LP, metano, temperatura y humedad (valor, unidad, "Última lectura", calidad); Operación (batería y estaciones); mapa asistido 2D (No disponible / Implementación futura); Eventos y Avisos</w:t>
             </w:r>
           </w:p>
         </w:tc>
@@ -7840,7 +7900,7 @@
                 <w:i w:val="0"/>
                 <w:sz w:val="17"/>
               </w:rPr>
-              <w:t>Pose y batería: telemetría. Misión: missions. Plano (archivo del mapa) y habitaciones: pendiente de backend</w:t>
+              <w:t>Telemetría en vivo (telemetry_frames y sus tablas hijas, deltas por stream_version + Realtime), unidades de channels y alertas</w:t>
             </w:r>
           </w:p>
         </w:tc>
@@ -7865,7 +7925,7 @@
                 <w:i w:val="0"/>
                 <w:sz w:val="17"/>
               </w:rPr>
-              <w:t>Misiones</w:t>
+              <w:t>Mapa</w:t>
             </w:r>
           </w:p>
         </w:tc>
@@ -7885,7 +7945,7 @@
                 <w:i w:val="0"/>
                 <w:sz w:val="17"/>
               </w:rPr>
-              <w:t>Detalles de misión, mapa de la misión, tarjetas de misiones, "Nueva misión"</w:t>
+              <w:t>Leyenda "No disponible / Implementación futura": el mapa asistido 2D (plano, pose, ruta y habitaciones) no se incluye en esta versión (lo implementará el equipo de IoT, ADR-009)</w:t>
             </w:r>
           </w:p>
         </w:tc>
@@ -7905,7 +7965,7 @@
                 <w:i w:val="0"/>
                 <w:sz w:val="17"/>
               </w:rPr>
-              <w:t>missions (inicio, fin, estado) y trayectoria de la telemetría. Nombre y estaciones: pendiente (B16). "Guardar" no envía nada (ver R9)</w:t>
+              <w:t>—</w:t>
             </w:r>
           </w:p>
         </w:tc>
@@ -7929,7 +7989,7 @@
                 <w:i w:val="0"/>
                 <w:sz w:val="17"/>
               </w:rPr>
-              <w:t>Historial</w:t>
+              <w:t>Misiones</w:t>
             </w:r>
           </w:p>
         </w:tc>
@@ -7948,7 +8008,7 @@
                 <w:i w:val="0"/>
                 <w:sz w:val="17"/>
               </w:rPr>
-              <w:t>Alertas registradas por severidad; "Lectura general" del canal elegido con máxima, mínima y promedio</w:t>
+              <w:t>Detalles de misión, tarjeta de mapa ("No disponible / Implementación futura"), tarjetas de misiones, "Nueva misión"</w:t>
             </w:r>
           </w:p>
         </w:tc>
@@ -7967,7 +8027,7 @@
                 <w:i w:val="0"/>
                 <w:sz w:val="17"/>
               </w:rPr>
-              <w:t>Alertas y frames históricos de Supabase. Misiones, horas de operación y calibraciones: pendiente</w:t>
+              <w:t>missions (inicio, fin, estado). Nombre y estaciones: pendiente (B16). "Guardar" no envía nada (ver R9)</w:t>
             </w:r>
           </w:p>
         </w:tc>
@@ -7992,7 +8052,7 @@
                 <w:i w:val="0"/>
                 <w:sz w:val="17"/>
               </w:rPr>
-              <w:t>Eventos (campana)</w:t>
+              <w:t>Historial</w:t>
             </w:r>
           </w:p>
         </w:tc>
@@ -8012,7 +8072,7 @@
                 <w:i w:val="0"/>
                 <w:sz w:val="17"/>
               </w:rPr>
-              <w:t>Alertas con filtros de periodo, severidad y estado; detalle de cada evento</w:t>
+              <w:t>Alertas registradas por severidad; "Lectura general" del canal elegido con máxima, mínima y promedio</w:t>
             </w:r>
           </w:p>
         </w:tc>
@@ -8032,7 +8092,7 @@
                 <w:i w:val="0"/>
                 <w:sz w:val="17"/>
               </w:rPr>
-              <w:t>Supabase: alertas</w:t>
+              <w:t>Alertas y frames históricos de Supabase. Misiones, horas de operación y calibraciones: pendiente</w:t>
             </w:r>
           </w:p>
         </w:tc>
@@ -8056,6 +8116,69 @@
                 <w:i w:val="0"/>
                 <w:sz w:val="17"/>
               </w:rPr>
+              <w:t>Eventos (campana)</w:t>
+            </w:r>
+          </w:p>
+        </w:tc>
+        <w:tc>
+          <w:tcPr>
+            <w:tcW w:type="dxa" w:w="3685"/>
+          </w:tcPr>
+          <w:p>
+            <w:pPr>
+              <w:spacing w:after="0"/>
+            </w:pPr>
+            <w:r/>
+            <w:r>
+              <w:rPr>
+                <w:b w:val="0"/>
+                <w:i w:val="0"/>
+                <w:sz w:val="17"/>
+              </w:rPr>
+              <w:t>Alertas con filtros de periodo, severidad y estado; detalle de cada evento</w:t>
+            </w:r>
+          </w:p>
+        </w:tc>
+        <w:tc>
+          <w:tcPr>
+            <w:tcW w:type="dxa" w:w="4252"/>
+          </w:tcPr>
+          <w:p>
+            <w:pPr>
+              <w:spacing w:after="0"/>
+            </w:pPr>
+            <w:r/>
+            <w:r>
+              <w:rPr>
+                <w:b w:val="0"/>
+                <w:i w:val="0"/>
+                <w:sz w:val="17"/>
+              </w:rPr>
+              <w:t>Supabase: alertas</w:t>
+            </w:r>
+          </w:p>
+        </w:tc>
+      </w:tr>
+      <w:tr>
+        <w:trPr>
+          <w:cantSplit w:val="true"/>
+        </w:trPr>
+        <w:tc>
+          <w:tcPr>
+            <w:tcW w:type="dxa" w:w="1701"/>
+            <w:shd w:val="clear" w:color="auto" w:fill="EEF2FF"/>
+          </w:tcPr>
+          <w:p>
+            <w:pPr>
+              <w:spacing w:after="0"/>
+            </w:pPr>
+            <w:r/>
+            <w:r>
+              <w:rPr>
+                <w:b w:val="0"/>
+                <w:i w:val="0"/>
+                <w:sz w:val="17"/>
+              </w:rPr>
               <w:t>Ajustes (engrane)</w:t>
             </w:r>
           </w:p>
@@ -8063,6 +8186,7 @@
         <w:tc>
           <w:tcPr>
             <w:tcW w:type="dxa" w:w="3685"/>
+            <w:shd w:val="clear" w:color="auto" w:fill="EEF2FF"/>
           </w:tcPr>
           <w:p>
             <w:pPr>
@@ -8082,6 +8206,7 @@
         <w:tc>
           <w:tcPr>
             <w:tcW w:type="dxa" w:w="4252"/>
+            <w:shd w:val="clear" w:color="auto" w:fill="EEF2FF"/>
           </w:tcPr>
           <w:p>
             <w:pPr>
@@ -8123,7 +8248,7 @@
           <w:b w:val="0"/>
           <w:i w:val="0"/>
         </w:rPr>
-        <w:t>Sin "Hola, nombre" ni "Cerrar sesión": dependen del inicio de sesión.</w:t>
+        <w:t>Encabezado con "Hola!" y el nombre del domicilio (no el de la persona); "Cerrar sesión" está en Ajustes.</w:t>
       </w:r>
     </w:p>
     <w:p>
@@ -8136,7 +8261,7 @@
           <w:b w:val="0"/>
           <w:i w:val="0"/>
         </w:rPr>
-        <w:t>Sin logo: el equipo todavía no lo define; se usa el ícono por defecto del sistema.</w:t>
+        <w:t>Logo, ícono y bienvenida del Manual de identidad corporativa, vectorizados desde las imágenes del PDF.</w:t>
       </w:r>
     </w:p>
     <w:p>
@@ -8175,7 +8300,7 @@
           <w:b w:val="0"/>
           <w:i w:val="0"/>
         </w:rPr>
-        <w:t>Lecturas por habitación: las debe calcular el backend con el plano validado.</w:t>
+        <w:t>Lecturas por habitación y mapa 2D: "No disponible · Implementación futura" (ADR-009).</w:t>
       </w:r>
     </w:p>
     <w:p>
@@ -8209,7 +8334,7 @@
           <w:b w:val="0"/>
           <w:i w:val="0"/>
         </w:rPr>
-        <w:t>Cada tarjeta es un solo elemento con descripción completa para lectores de pantalla; mapa, gráfica y dona tienen texto alternativo.</w:t>
+        <w:t>Cada tarjeta es un solo elemento con descripción completa para lectores de pantalla; gráfica y dona tienen texto alternativo.</w:t>
       </w:r>
     </w:p>
     <w:p>
@@ -13986,7 +14111,7 @@
                 <w:i w:val="0"/>
                 <w:sz w:val="18"/>
               </w:rPr>
-              <w:t>Demostración beta con lectura pública (sin inicio de sesión)</w:t>
+              <w:t>Autenticación completa con Supabase Auth e integración de interfaz</w:t>
             </w:r>
           </w:p>
         </w:tc>
@@ -14006,7 +14131,196 @@
                 <w:i w:val="0"/>
                 <w:sz w:val="18"/>
               </w:rPr>
+              <w:t>Aceptada</w:t>
+            </w:r>
+          </w:p>
+        </w:tc>
+      </w:tr>
+      <w:tr>
+        <w:trPr>
+          <w:cantSplit w:val="true"/>
+        </w:trPr>
+        <w:tc>
+          <w:tcPr>
+            <w:tcW w:type="dxa" w:w="1134"/>
+          </w:tcPr>
+          <w:p>
+            <w:pPr>
+              <w:spacing w:after="0"/>
+            </w:pPr>
+            <w:r/>
+            <w:r>
+              <w:rPr>
+                <w:b w:val="0"/>
+                <w:i w:val="0"/>
+                <w:sz w:val="18"/>
+              </w:rPr>
+              <w:t>ADR-007</w:t>
+            </w:r>
+          </w:p>
+        </w:tc>
+        <w:tc>
+          <w:tcPr>
+            <w:tcW w:type="dxa" w:w="5669"/>
+          </w:tcPr>
+          <w:p>
+            <w:pPr>
+              <w:spacing w:after="0"/>
+            </w:pPr>
+            <w:r/>
+            <w:r>
+              <w:rPr>
+                <w:b w:val="0"/>
+                <w:i w:val="0"/>
+                <w:sz w:val="18"/>
+              </w:rPr>
+              <w:t>Demostración beta con lectura pública (sin inicio de sesión)</w:t>
+            </w:r>
+          </w:p>
+        </w:tc>
+        <w:tc>
+          <w:tcPr>
+            <w:tcW w:type="dxa" w:w="2835"/>
+          </w:tcPr>
+          <w:p>
+            <w:pPr>
+              <w:spacing w:after="0"/>
+            </w:pPr>
+            <w:r/>
+            <w:r>
+              <w:rPr>
+                <w:b w:val="0"/>
+                <w:i w:val="0"/>
+                <w:sz w:val="18"/>
+              </w:rPr>
               <w:t>Aceptada (temporal)</w:t>
+            </w:r>
+          </w:p>
+        </w:tc>
+      </w:tr>
+      <w:tr>
+        <w:trPr>
+          <w:cantSplit w:val="true"/>
+        </w:trPr>
+        <w:tc>
+          <w:tcPr>
+            <w:tcW w:type="dxa" w:w="1134"/>
+            <w:shd w:val="clear" w:color="auto" w:fill="EEF2FF"/>
+          </w:tcPr>
+          <w:p>
+            <w:pPr>
+              <w:spacing w:after="0"/>
+            </w:pPr>
+            <w:r/>
+            <w:r>
+              <w:rPr>
+                <w:b w:val="0"/>
+                <w:i w:val="0"/>
+                <w:sz w:val="18"/>
+              </w:rPr>
+              <w:t>ADR-008</w:t>
+            </w:r>
+          </w:p>
+        </w:tc>
+        <w:tc>
+          <w:tcPr>
+            <w:tcW w:type="dxa" w:w="5669"/>
+            <w:shd w:val="clear" w:color="auto" w:fill="EEF2FF"/>
+          </w:tcPr>
+          <w:p>
+            <w:pPr>
+              <w:spacing w:after="0"/>
+            </w:pPr>
+            <w:r/>
+            <w:r>
+              <w:rPr>
+                <w:b w:val="0"/>
+                <w:i w:val="0"/>
+                <w:sz w:val="18"/>
+              </w:rPr>
+              <w:t>Identidad visual V.I.S.O.R. (Manual de identidad corporativa)</w:t>
+            </w:r>
+          </w:p>
+        </w:tc>
+        <w:tc>
+          <w:tcPr>
+            <w:tcW w:type="dxa" w:w="2835"/>
+            <w:shd w:val="clear" w:color="auto" w:fill="EEF2FF"/>
+          </w:tcPr>
+          <w:p>
+            <w:pPr>
+              <w:spacing w:after="0"/>
+            </w:pPr>
+            <w:r/>
+            <w:r>
+              <w:rPr>
+                <w:b w:val="0"/>
+                <w:i w:val="0"/>
+                <w:sz w:val="18"/>
+              </w:rPr>
+              <w:t>Aceptada</w:t>
+            </w:r>
+          </w:p>
+        </w:tc>
+      </w:tr>
+      <w:tr>
+        <w:trPr>
+          <w:cantSplit w:val="true"/>
+        </w:trPr>
+        <w:tc>
+          <w:tcPr>
+            <w:tcW w:type="dxa" w:w="1134"/>
+          </w:tcPr>
+          <w:p>
+            <w:pPr>
+              <w:spacing w:after="0"/>
+            </w:pPr>
+            <w:r/>
+            <w:r>
+              <w:rPr>
+                <w:b w:val="0"/>
+                <w:i w:val="0"/>
+                <w:sz w:val="18"/>
+              </w:rPr>
+              <w:t>ADR-009</w:t>
+            </w:r>
+          </w:p>
+        </w:tc>
+        <w:tc>
+          <w:tcPr>
+            <w:tcW w:type="dxa" w:w="5669"/>
+          </w:tcPr>
+          <w:p>
+            <w:pPr>
+              <w:spacing w:after="0"/>
+            </w:pPr>
+            <w:r/>
+            <w:r>
+              <w:rPr>
+                <w:b w:val="0"/>
+                <w:i w:val="0"/>
+                <w:sz w:val="18"/>
+              </w:rPr>
+              <w:t>El mapa asistido 2D queda fuera de esta versión</w:t>
+            </w:r>
+          </w:p>
+        </w:tc>
+        <w:tc>
+          <w:tcPr>
+            <w:tcW w:type="dxa" w:w="2835"/>
+          </w:tcPr>
+          <w:p>
+            <w:pPr>
+              <w:spacing w:after="0"/>
+            </w:pPr>
+            <w:r/>
+            <w:r>
+              <w:rPr>
+                <w:b w:val="0"/>
+                <w:i w:val="0"/>
+                <w:sz w:val="18"/>
+              </w:rPr>
+              <w:t>Aceptada</w:t>
             </w:r>
           </w:p>
         </w:tc>
@@ -14122,7 +14436,7 @@
           <w:b w:val="0"/>
           <w:i w:val="0"/>
         </w:rPr>
-        <w:t xml:space="preserve">Sin simulador; sin pantalla de login por ahora; contratos provisionales para plano y misiones; </w:t>
+        <w:t xml:space="preserve">Sin simulador; el inicio de sesión se difirió (resuelto en ADR-006); contrato provisional para misiones; </w:t>
       </w:r>
       <w:r>
         <w:rPr>
@@ -14145,7 +14459,62 @@
         <w:pStyle w:val="Heading3"/>
       </w:pPr>
       <w:r>
-        <w:t>ADR-006: Demostración beta con lectura pública</w:t>
+        <w:t>ADR-006: Autenticación completa con Supabase Auth e integración de interfaz</w:t>
+      </w:r>
+    </w:p>
+    <w:p>
+      <w:r>
+        <w:rPr>
+          <w:rFonts w:ascii="Consolas" w:hAnsi="Consolas" w:eastAsia="Consolas"/>
+          <w:i w:val="0"/>
+          <w:sz w:val="19"/>
+        </w:rPr>
+        <w:t>LoginScreen</w:t>
+      </w:r>
+      <w:r>
+        <w:rPr>
+          <w:b w:val="0"/>
+          <w:i w:val="0"/>
+        </w:rPr>
+        <w:t xml:space="preserve"> y </w:t>
+      </w:r>
+      <w:r>
+        <w:rPr>
+          <w:rFonts w:ascii="Consolas" w:hAnsi="Consolas" w:eastAsia="Consolas"/>
+          <w:i w:val="0"/>
+          <w:sz w:val="19"/>
+        </w:rPr>
+        <w:t>LoginViewModel</w:t>
+      </w:r>
+      <w:r>
+        <w:rPr>
+          <w:b w:val="0"/>
+          <w:i w:val="0"/>
+        </w:rPr>
+        <w:t xml:space="preserve">, recuperación de acceso, cierre de sesión en Ajustes y </w:t>
+      </w:r>
+      <w:r>
+        <w:rPr>
+          <w:rFonts w:ascii="Consolas" w:hAnsi="Consolas" w:eastAsia="Consolas"/>
+          <w:i w:val="0"/>
+          <w:sz w:val="19"/>
+        </w:rPr>
+        <w:t>RootState.NeedsLogin</w:t>
+      </w:r>
+      <w:r>
+        <w:rPr>
+          <w:b w:val="0"/>
+          <w:i w:val="0"/>
+        </w:rPr>
+        <w:t>.</w:t>
+      </w:r>
+    </w:p>
+    <w:p>
+      <w:pPr>
+        <w:pStyle w:val="Heading3"/>
+      </w:pPr>
+      <w:r>
+        <w:t>ADR-007: Demostración beta con lectura pública</w:t>
       </w:r>
     </w:p>
     <w:p>
@@ -14170,6 +14539,40 @@
           <w:i w:val="0"/>
         </w:rPr>
         <w:t xml:space="preserve"> que lee con la clave pública, sin sesión. Temporal: depende de B19 y caduca al cerrarlo.</w:t>
+      </w:r>
+    </w:p>
+    <w:p>
+      <w:pPr>
+        <w:pStyle w:val="Heading3"/>
+      </w:pPr>
+      <w:r>
+        <w:t>ADR-008: Identidad visual V.I.S.O.R.</w:t>
+      </w:r>
+    </w:p>
+    <w:p>
+      <w:r>
+        <w:rPr>
+          <w:b w:val="0"/>
+          <w:i w:val="0"/>
+        </w:rPr>
+        <w:t>Isotipo, ícono adaptativo, bienvenida, paleta oficial, Questrial y Poppins, y 20 íconos de la marca vectorizados del manual.</w:t>
+      </w:r>
+    </w:p>
+    <w:p>
+      <w:pPr>
+        <w:pStyle w:val="Heading3"/>
+      </w:pPr>
+      <w:r>
+        <w:t>ADR-009: El mapa asistido 2D queda fuera de esta versión</w:t>
+      </w:r>
+    </w:p>
+    <w:p>
+      <w:r>
+        <w:rPr>
+          <w:b w:val="0"/>
+          <w:i w:val="0"/>
+        </w:rPr>
+        <w:t>Se retiran la vista, la trayectoria y el plano; la app muestra "No disponible · Implementación futura".</w:t>
       </w:r>
     </w:p>
     <w:p>
@@ -14410,7 +14813,7 @@
                 <w:i w:val="0"/>
                 <w:sz w:val="15"/>
               </w:rPr>
-              <w:t>Implementado. La autorización real es RLS del servidor (RNF09)</w:t>
+              <w:t>Implementado. Implementado con Supabase Auth y sesión reactiva. La autorización real es RLS del servidor (RNF09)</w:t>
             </w:r>
           </w:p>
         </w:tc>
@@ -14820,7 +15223,7 @@
                 <w:i w:val="0"/>
                 <w:sz w:val="15"/>
               </w:rPr>
-              <w:t>Parcial. Se conserva la versión de mapa del frame. La geometría y el listado de estaciones están pendientes</w:t>
+              <w:t>Fuera de la app. El mapa 2D no se incluye en esta versión (implementación futura, IoT; ADR-009). Se conserva la versión de mapa del frame</w:t>
             </w:r>
           </w:p>
         </w:tc>
@@ -14925,7 +15328,7 @@
                 <w:i w:val="0"/>
                 <w:sz w:val="15"/>
               </w:rPr>
-              <w:t>Parcial. Faltan las estaciones omitidas y su causa (contrato de misiones pendiente)</w:t>
+              <w:t>Fuera de la app. Pose e incertidumbre se conservan en el dominio, pero no se dibujan (ADR-009). Faltan las estaciones omitidas y su causa (contrato de misiones pendiente)</w:t>
             </w:r>
           </w:p>
         </w:tc>
@@ -15540,7 +15943,7 @@
                 <w:i w:val="0"/>
                 <w:sz w:val="15"/>
               </w:rPr>
-              <w:t>Parcial. Propuesta implementada; falta validación con el equipo de diseño</w:t>
+              <w:t>Implementado. Paletas claro/oscuro, cambio suave de tema, Poppins tabular y adaptabilidad móvil/tablet</w:t>
             </w:r>
           </w:p>
         </w:tc>
@@ -16255,7 +16658,7 @@
                 <w:i w:val="0"/>
                 <w:sz w:val="15"/>
               </w:rPr>
-              <w:t>Fuera de la app. La validación y el vínculo de mapas los hacen backend e IoT; la consulta espera el contrato de mapas</w:t>
+              <w:t>Fuera de la app. La validación y el vínculo de mapas los hacen backend e IoT; no se incluye en esta versión (ADR-009)</w:t>
             </w:r>
           </w:p>
         </w:tc>
@@ -16499,7 +16902,7 @@
                 <w:i w:val="0"/>
                 <w:sz w:val="15"/>
               </w:rPr>
-              <w:t>identity (SignIn, SignOut, SelectHomeScope, CurrentHomeScope); SupabaseAuthAdapter, SupabaseHomeScopeAdapter</w:t>
+              <w:t>identity (SignIn, SignOut, SelectHomeScope, CurrentHomeScope); SupabaseAuthAdapter, SupabaseHomeScopeAdapter; LoginScreen, LoginViewModel</w:t>
             </w:r>
           </w:p>
         </w:tc>
@@ -17198,7 +17601,7 @@
                 <w:i w:val="0"/>
                 <w:sz w:val="15"/>
               </w:rPr>
-              <w:t>ui/theme (tokens claro/oscuro, ThemePreference), SettingsSheet</w:t>
+              <w:t>ui/theme (tokens claro/oscuro, ThemePreference, CentinelaShapes), SettingsSheet, LoginScreen</w:t>
             </w:r>
           </w:p>
         </w:tc>
@@ -17218,7 +17621,7 @@
                 <w:i w:val="0"/>
                 <w:sz w:val="15"/>
               </w:rPr>
-              <w:t>—</w:t>
+              <w:t>PresentationTest</w:t>
             </w:r>
           </w:p>
         </w:tc>
@@ -17865,7 +18268,7 @@
                 <w:i w:val="0"/>
                 <w:sz w:val="16"/>
               </w:rPr>
-              <w:t>HomeSelectionScreen</w:t>
+              <w:t>LoginScreen, LoginViewModel, HomeSelectionScreen</w:t>
             </w:r>
           </w:p>
         </w:tc>
@@ -17884,7 +18287,7 @@
                 <w:i w:val="0"/>
                 <w:sz w:val="16"/>
               </w:rPr>
-              <w:t>Selección explícita de domicilio. El inicio de sesión se integra al final (indicación del equipo)</w:t>
+              <w:t>Inicio de sesión, recuperación de acceso, cierre de sesión y selección explícita de domicilio (ADR-006). Sin usuario con membresía (B21) no se ve ningún domicilio</w:t>
             </w:r>
           </w:p>
         </w:tc>
@@ -18119,7 +18522,7 @@
                 <w:i w:val="0"/>
                 <w:sz w:val="16"/>
               </w:rPr>
-              <w:t>FloorPlanView, MapScreen, MissionsScreen</w:t>
+              <w:t>MapScreen, FutureFeatureNotice, MissionsScreen</w:t>
             </w:r>
           </w:p>
         </w:tc>
@@ -18138,7 +18541,7 @@
                 <w:i w:val="0"/>
                 <w:sz w:val="16"/>
               </w:rPr>
-              <w:t>Trayectoria sobre la versión exacta de mapa; incertidumbre distinta de la huella; estaciones omitidas con causa</w:t>
+              <w:t>Leyenda "No disponible / Implementación futura" en lugar del mapa; estaciones omitidas con causa en Misiones</w:t>
             </w:r>
           </w:p>
         </w:tc>
@@ -19784,7 +20187,7 @@
                 <w:i w:val="0"/>
                 <w:sz w:val="17"/>
               </w:rPr>
-              <w:t>Implementado. Implementada, temporal y atada a B19 (ADR-006). Pruebas: PublicReadAuthAdapterTest, NormalizedFrameAssemblerTest</w:t>
+              <w:t>Implementado. Implementada, temporal y atada a B19 (ADR-007). Pruebas: PublicReadAuthAdapterTest, NormalizedFrameAssemblerTest</w:t>
             </w:r>
           </w:p>
         </w:tc>
@@ -20745,6 +21148,1002 @@
           </w:p>
         </w:tc>
       </w:tr>
+      <w:tr>
+        <w:trPr>
+          <w:cantSplit w:val="true"/>
+        </w:trPr>
+        <w:tc>
+          <w:tcPr>
+            <w:tcW w:type="dxa" w:w="1020"/>
+          </w:tcPr>
+          <w:p>
+            <w:pPr>
+              <w:spacing w:after="0"/>
+            </w:pPr>
+            <w:r/>
+            <w:r>
+              <w:rPr>
+                <w:b w:val="0"/>
+                <w:i w:val="0"/>
+                <w:sz w:val="16"/>
+              </w:rPr>
+              <w:t>d13bc85</w:t>
+            </w:r>
+          </w:p>
+        </w:tc>
+        <w:tc>
+          <w:tcPr>
+            <w:tcW w:type="dxa" w:w="2041"/>
+          </w:tcPr>
+          <w:p>
+            <w:pPr>
+              <w:spacing w:after="0"/>
+            </w:pPr>
+            <w:r/>
+            <w:r>
+              <w:rPr>
+                <w:b w:val="0"/>
+                <w:i w:val="0"/>
+                <w:sz w:val="16"/>
+              </w:rPr>
+              <w:t>yaelrdf</w:t>
+            </w:r>
+          </w:p>
+        </w:tc>
+        <w:tc>
+          <w:tcPr>
+            <w:tcW w:type="dxa" w:w="1247"/>
+          </w:tcPr>
+          <w:p>
+            <w:pPr>
+              <w:spacing w:after="0"/>
+            </w:pPr>
+            <w:r/>
+            <w:r>
+              <w:rPr>
+                <w:b w:val="0"/>
+                <w:i w:val="0"/>
+                <w:sz w:val="16"/>
+              </w:rPr>
+              <w:t>2026-10-29</w:t>
+            </w:r>
+          </w:p>
+        </w:tc>
+        <w:tc>
+          <w:tcPr>
+            <w:tcW w:type="dxa" w:w="5329"/>
+          </w:tcPr>
+          <w:p>
+            <w:pPr>
+              <w:spacing w:after="0"/>
+            </w:pPr>
+            <w:r/>
+            <w:r>
+              <w:rPr>
+                <w:b w:val="0"/>
+                <w:i w:val="0"/>
+                <w:sz w:val="16"/>
+              </w:rPr>
+              <w:t>build: agregar build type demo con lectura pública sin inicio de sesión</w:t>
+            </w:r>
+          </w:p>
+        </w:tc>
+      </w:tr>
+      <w:tr>
+        <w:trPr>
+          <w:cantSplit w:val="true"/>
+        </w:trPr>
+        <w:tc>
+          <w:tcPr>
+            <w:tcW w:type="dxa" w:w="1020"/>
+            <w:shd w:val="clear" w:color="auto" w:fill="EEF2FF"/>
+          </w:tcPr>
+          <w:p>
+            <w:pPr>
+              <w:spacing w:after="0"/>
+            </w:pPr>
+            <w:r/>
+            <w:r>
+              <w:rPr>
+                <w:b w:val="0"/>
+                <w:i w:val="0"/>
+                <w:sz w:val="16"/>
+              </w:rPr>
+              <w:t>04f8e2a</w:t>
+            </w:r>
+          </w:p>
+        </w:tc>
+        <w:tc>
+          <w:tcPr>
+            <w:tcW w:type="dxa" w:w="2041"/>
+            <w:shd w:val="clear" w:color="auto" w:fill="EEF2FF"/>
+          </w:tcPr>
+          <w:p>
+            <w:pPr>
+              <w:spacing w:after="0"/>
+            </w:pPr>
+            <w:r/>
+            <w:r>
+              <w:rPr>
+                <w:b w:val="0"/>
+                <w:i w:val="0"/>
+                <w:sz w:val="16"/>
+              </w:rPr>
+              <w:t>yaelrdf</w:t>
+            </w:r>
+          </w:p>
+        </w:tc>
+        <w:tc>
+          <w:tcPr>
+            <w:tcW w:type="dxa" w:w="1247"/>
+            <w:shd w:val="clear" w:color="auto" w:fill="EEF2FF"/>
+          </w:tcPr>
+          <w:p>
+            <w:pPr>
+              <w:spacing w:after="0"/>
+            </w:pPr>
+            <w:r/>
+            <w:r>
+              <w:rPr>
+                <w:b w:val="0"/>
+                <w:i w:val="0"/>
+                <w:sz w:val="16"/>
+              </w:rPr>
+              <w:t>2026-10-29</w:t>
+            </w:r>
+          </w:p>
+        </w:tc>
+        <w:tc>
+          <w:tcPr>
+            <w:tcW w:type="dxa" w:w="5329"/>
+            <w:shd w:val="clear" w:color="auto" w:fill="EEF2FF"/>
+          </w:tcPr>
+          <w:p>
+            <w:pPr>
+              <w:spacing w:after="0"/>
+            </w:pPr>
+            <w:r/>
+            <w:r>
+              <w:rPr>
+                <w:b w:val="0"/>
+                <w:i w:val="0"/>
+                <w:sz w:val="16"/>
+              </w:rPr>
+              <w:t>docs: actualizar estado, arquitectura y pendientes tras integrar dev</w:t>
+            </w:r>
+          </w:p>
+        </w:tc>
+      </w:tr>
+      <w:tr>
+        <w:trPr>
+          <w:cantSplit w:val="true"/>
+        </w:trPr>
+        <w:tc>
+          <w:tcPr>
+            <w:tcW w:type="dxa" w:w="1020"/>
+          </w:tcPr>
+          <w:p>
+            <w:pPr>
+              <w:spacing w:after="0"/>
+            </w:pPr>
+            <w:r/>
+            <w:r>
+              <w:rPr>
+                <w:b w:val="0"/>
+                <w:i w:val="0"/>
+                <w:sz w:val="16"/>
+              </w:rPr>
+              <w:t>0b93f0c</w:t>
+            </w:r>
+          </w:p>
+        </w:tc>
+        <w:tc>
+          <w:tcPr>
+            <w:tcW w:type="dxa" w:w="2041"/>
+          </w:tcPr>
+          <w:p>
+            <w:pPr>
+              <w:spacing w:after="0"/>
+            </w:pPr>
+            <w:r/>
+            <w:r>
+              <w:rPr>
+                <w:b w:val="0"/>
+                <w:i w:val="0"/>
+                <w:sz w:val="16"/>
+              </w:rPr>
+              <w:t>yaelrdf</w:t>
+            </w:r>
+          </w:p>
+        </w:tc>
+        <w:tc>
+          <w:tcPr>
+            <w:tcW w:type="dxa" w:w="1247"/>
+          </w:tcPr>
+          <w:p>
+            <w:pPr>
+              <w:spacing w:after="0"/>
+            </w:pPr>
+            <w:r/>
+            <w:r>
+              <w:rPr>
+                <w:b w:val="0"/>
+                <w:i w:val="0"/>
+                <w:sz w:val="16"/>
+              </w:rPr>
+              <w:t>2026-10-29</w:t>
+            </w:r>
+          </w:p>
+        </w:tc>
+        <w:tc>
+          <w:tcPr>
+            <w:tcW w:type="dxa" w:w="5329"/>
+          </w:tcPr>
+          <w:p>
+            <w:pPr>
+              <w:spacing w:after="0"/>
+            </w:pPr>
+            <w:r/>
+            <w:r>
+              <w:rPr>
+                <w:b w:val="0"/>
+                <w:i w:val="0"/>
+                <w:sz w:val="16"/>
+              </w:rPr>
+              <w:t>docs: notas de versión 0.3.0-beta y documentación completa en Word</w:t>
+            </w:r>
+          </w:p>
+        </w:tc>
+      </w:tr>
+      <w:tr>
+        <w:trPr>
+          <w:cantSplit w:val="true"/>
+        </w:trPr>
+        <w:tc>
+          <w:tcPr>
+            <w:tcW w:type="dxa" w:w="1020"/>
+            <w:shd w:val="clear" w:color="auto" w:fill="EEF2FF"/>
+          </w:tcPr>
+          <w:p>
+            <w:pPr>
+              <w:spacing w:after="0"/>
+            </w:pPr>
+            <w:r/>
+            <w:r>
+              <w:rPr>
+                <w:b w:val="0"/>
+                <w:i w:val="0"/>
+                <w:sz w:val="16"/>
+              </w:rPr>
+              <w:t>92e2564</w:t>
+            </w:r>
+          </w:p>
+        </w:tc>
+        <w:tc>
+          <w:tcPr>
+            <w:tcW w:type="dxa" w:w="2041"/>
+            <w:shd w:val="clear" w:color="auto" w:fill="EEF2FF"/>
+          </w:tcPr>
+          <w:p>
+            <w:pPr>
+              <w:spacing w:after="0"/>
+            </w:pPr>
+            <w:r/>
+            <w:r>
+              <w:rPr>
+                <w:b w:val="0"/>
+                <w:i w:val="0"/>
+                <w:sz w:val="16"/>
+              </w:rPr>
+              <w:t>Alejandro González Hernández</w:t>
+            </w:r>
+          </w:p>
+        </w:tc>
+        <w:tc>
+          <w:tcPr>
+            <w:tcW w:type="dxa" w:w="1247"/>
+            <w:shd w:val="clear" w:color="auto" w:fill="EEF2FF"/>
+          </w:tcPr>
+          <w:p>
+            <w:pPr>
+              <w:spacing w:after="0"/>
+            </w:pPr>
+            <w:r/>
+            <w:r>
+              <w:rPr>
+                <w:b w:val="0"/>
+                <w:i w:val="0"/>
+                <w:sz w:val="16"/>
+              </w:rPr>
+              <w:t>2026-10-29</w:t>
+            </w:r>
+          </w:p>
+        </w:tc>
+        <w:tc>
+          <w:tcPr>
+            <w:tcW w:type="dxa" w:w="5329"/>
+            <w:shd w:val="clear" w:color="auto" w:fill="EEF2FF"/>
+          </w:tcPr>
+          <w:p>
+            <w:pPr>
+              <w:spacing w:after="0"/>
+            </w:pPr>
+            <w:r/>
+            <w:r>
+              <w:rPr>
+                <w:b w:val="0"/>
+                <w:i w:val="0"/>
+                <w:sz w:val="16"/>
+              </w:rPr>
+              <w:t>feat(ui): implementar pantalla de login, cierre de sesión, optimizaciones y documentación</w:t>
+            </w:r>
+          </w:p>
+        </w:tc>
+      </w:tr>
+      <w:tr>
+        <w:trPr>
+          <w:cantSplit w:val="true"/>
+        </w:trPr>
+        <w:tc>
+          <w:tcPr>
+            <w:tcW w:type="dxa" w:w="1020"/>
+          </w:tcPr>
+          <w:p>
+            <w:pPr>
+              <w:spacing w:after="0"/>
+            </w:pPr>
+            <w:r/>
+            <w:r>
+              <w:rPr>
+                <w:b w:val="0"/>
+                <w:i w:val="0"/>
+                <w:sz w:val="16"/>
+              </w:rPr>
+              <w:t>39318c2</w:t>
+            </w:r>
+          </w:p>
+        </w:tc>
+        <w:tc>
+          <w:tcPr>
+            <w:tcW w:type="dxa" w:w="2041"/>
+          </w:tcPr>
+          <w:p>
+            <w:pPr>
+              <w:spacing w:after="0"/>
+            </w:pPr>
+            <w:r/>
+            <w:r>
+              <w:rPr>
+                <w:b w:val="0"/>
+                <w:i w:val="0"/>
+                <w:sz w:val="16"/>
+              </w:rPr>
+              <w:t>Alejandro González Hernández</w:t>
+            </w:r>
+          </w:p>
+        </w:tc>
+        <w:tc>
+          <w:tcPr>
+            <w:tcW w:type="dxa" w:w="1247"/>
+          </w:tcPr>
+          <w:p>
+            <w:pPr>
+              <w:spacing w:after="0"/>
+            </w:pPr>
+            <w:r/>
+            <w:r>
+              <w:rPr>
+                <w:b w:val="0"/>
+                <w:i w:val="0"/>
+                <w:sz w:val="16"/>
+              </w:rPr>
+              <w:t>2026-10-29</w:t>
+            </w:r>
+          </w:p>
+        </w:tc>
+        <w:tc>
+          <w:tcPr>
+            <w:tcW w:type="dxa" w:w="5329"/>
+          </w:tcPr>
+          <w:p>
+            <w:pPr>
+              <w:spacing w:after="0"/>
+            </w:pPr>
+            <w:r/>
+            <w:r>
+              <w:rPr>
+                <w:b w:val="0"/>
+                <w:i w:val="0"/>
+                <w:sz w:val="16"/>
+              </w:rPr>
+              <w:t>perf(telemetry, ui): optimizar consumo de memoria en sincronización y renderizado</w:t>
+            </w:r>
+          </w:p>
+        </w:tc>
+      </w:tr>
+      <w:tr>
+        <w:trPr>
+          <w:cantSplit w:val="true"/>
+        </w:trPr>
+        <w:tc>
+          <w:tcPr>
+            <w:tcW w:type="dxa" w:w="1020"/>
+            <w:shd w:val="clear" w:color="auto" w:fill="EEF2FF"/>
+          </w:tcPr>
+          <w:p>
+            <w:pPr>
+              <w:spacing w:after="0"/>
+            </w:pPr>
+            <w:r/>
+            <w:r>
+              <w:rPr>
+                <w:b w:val="0"/>
+                <w:i w:val="0"/>
+                <w:sz w:val="16"/>
+              </w:rPr>
+              <w:t>4a0d30a</w:t>
+            </w:r>
+          </w:p>
+        </w:tc>
+        <w:tc>
+          <w:tcPr>
+            <w:tcW w:type="dxa" w:w="2041"/>
+            <w:shd w:val="clear" w:color="auto" w:fill="EEF2FF"/>
+          </w:tcPr>
+          <w:p>
+            <w:pPr>
+              <w:spacing w:after="0"/>
+            </w:pPr>
+            <w:r/>
+            <w:r>
+              <w:rPr>
+                <w:b w:val="0"/>
+                <w:i w:val="0"/>
+                <w:sz w:val="16"/>
+              </w:rPr>
+              <w:t>Alejandro González Hernández</w:t>
+            </w:r>
+          </w:p>
+        </w:tc>
+        <w:tc>
+          <w:tcPr>
+            <w:tcW w:type="dxa" w:w="1247"/>
+            <w:shd w:val="clear" w:color="auto" w:fill="EEF2FF"/>
+          </w:tcPr>
+          <w:p>
+            <w:pPr>
+              <w:spacing w:after="0"/>
+            </w:pPr>
+            <w:r/>
+            <w:r>
+              <w:rPr>
+                <w:b w:val="0"/>
+                <w:i w:val="0"/>
+                <w:sz w:val="16"/>
+              </w:rPr>
+              <w:t>2026-10-30</w:t>
+            </w:r>
+          </w:p>
+        </w:tc>
+        <w:tc>
+          <w:tcPr>
+            <w:tcW w:type="dxa" w:w="5329"/>
+            <w:shd w:val="clear" w:color="auto" w:fill="EEF2FF"/>
+          </w:tcPr>
+          <w:p>
+            <w:pPr>
+              <w:spacing w:after="0"/>
+            </w:pPr>
+            <w:r/>
+            <w:r>
+              <w:rPr>
+                <w:b w:val="0"/>
+                <w:i w:val="0"/>
+                <w:sz w:val="16"/>
+              </w:rPr>
+              <w:t>feat(ui): refinar diseño Lunar Base, animaciones, adaptabilidad y documentar estado del proyecto</w:t>
+            </w:r>
+          </w:p>
+        </w:tc>
+      </w:tr>
+      <w:tr>
+        <w:trPr>
+          <w:cantSplit w:val="true"/>
+        </w:trPr>
+        <w:tc>
+          <w:tcPr>
+            <w:tcW w:type="dxa" w:w="1020"/>
+          </w:tcPr>
+          <w:p>
+            <w:pPr>
+              <w:spacing w:after="0"/>
+            </w:pPr>
+            <w:r/>
+            <w:r>
+              <w:rPr>
+                <w:b w:val="0"/>
+                <w:i w:val="0"/>
+                <w:sz w:val="16"/>
+              </w:rPr>
+              <w:t>5aee19c</w:t>
+            </w:r>
+          </w:p>
+        </w:tc>
+        <w:tc>
+          <w:tcPr>
+            <w:tcW w:type="dxa" w:w="2041"/>
+          </w:tcPr>
+          <w:p>
+            <w:pPr>
+              <w:spacing w:after="0"/>
+            </w:pPr>
+            <w:r/>
+            <w:r>
+              <w:rPr>
+                <w:b w:val="0"/>
+                <w:i w:val="0"/>
+                <w:sz w:val="16"/>
+              </w:rPr>
+              <w:t>yaelrdf</w:t>
+            </w:r>
+          </w:p>
+        </w:tc>
+        <w:tc>
+          <w:tcPr>
+            <w:tcW w:type="dxa" w:w="1247"/>
+          </w:tcPr>
+          <w:p>
+            <w:pPr>
+              <w:spacing w:after="0"/>
+            </w:pPr>
+            <w:r/>
+            <w:r>
+              <w:rPr>
+                <w:b w:val="0"/>
+                <w:i w:val="0"/>
+                <w:sz w:val="16"/>
+              </w:rPr>
+              <w:t>2026-10-30</w:t>
+            </w:r>
+          </w:p>
+        </w:tc>
+        <w:tc>
+          <w:tcPr>
+            <w:tcW w:type="dxa" w:w="5329"/>
+          </w:tcPr>
+          <w:p>
+            <w:pPr>
+              <w:spacing w:after="0"/>
+            </w:pPr>
+            <w:r/>
+            <w:r>
+              <w:rPr>
+                <w:b w:val="0"/>
+                <w:i w:val="0"/>
+                <w:sz w:val="16"/>
+              </w:rPr>
+              <w:t>Merge dev en main: login real, rediseño y optimización de memoria</w:t>
+            </w:r>
+          </w:p>
+        </w:tc>
+      </w:tr>
+      <w:tr>
+        <w:trPr>
+          <w:cantSplit w:val="true"/>
+        </w:trPr>
+        <w:tc>
+          <w:tcPr>
+            <w:tcW w:type="dxa" w:w="1020"/>
+            <w:shd w:val="clear" w:color="auto" w:fill="EEF2FF"/>
+          </w:tcPr>
+          <w:p>
+            <w:pPr>
+              <w:spacing w:after="0"/>
+            </w:pPr>
+            <w:r/>
+            <w:r>
+              <w:rPr>
+                <w:b w:val="0"/>
+                <w:i w:val="0"/>
+                <w:sz w:val="16"/>
+              </w:rPr>
+              <w:t>8e2f7fa</w:t>
+            </w:r>
+          </w:p>
+        </w:tc>
+        <w:tc>
+          <w:tcPr>
+            <w:tcW w:type="dxa" w:w="2041"/>
+            <w:shd w:val="clear" w:color="auto" w:fill="EEF2FF"/>
+          </w:tcPr>
+          <w:p>
+            <w:pPr>
+              <w:spacing w:after="0"/>
+            </w:pPr>
+            <w:r/>
+            <w:r>
+              <w:rPr>
+                <w:b w:val="0"/>
+                <w:i w:val="0"/>
+                <w:sz w:val="16"/>
+              </w:rPr>
+              <w:t>yaelrdf</w:t>
+            </w:r>
+          </w:p>
+        </w:tc>
+        <w:tc>
+          <w:tcPr>
+            <w:tcW w:type="dxa" w:w="1247"/>
+            <w:shd w:val="clear" w:color="auto" w:fill="EEF2FF"/>
+          </w:tcPr>
+          <w:p>
+            <w:pPr>
+              <w:spacing w:after="0"/>
+            </w:pPr>
+            <w:r/>
+            <w:r>
+              <w:rPr>
+                <w:b w:val="0"/>
+                <w:i w:val="0"/>
+                <w:sz w:val="16"/>
+              </w:rPr>
+              <w:t>2026-10-31</w:t>
+            </w:r>
+          </w:p>
+        </w:tc>
+        <w:tc>
+          <w:tcPr>
+            <w:tcW w:type="dxa" w:w="5329"/>
+            <w:shd w:val="clear" w:color="auto" w:fill="EEF2FF"/>
+          </w:tcPr>
+          <w:p>
+            <w:pPr>
+              <w:spacing w:after="0"/>
+            </w:pPr>
+            <w:r/>
+            <w:r>
+              <w:rPr>
+                <w:b w:val="0"/>
+                <w:i w:val="0"/>
+                <w:sz w:val="16"/>
+              </w:rPr>
+              <w:t>build: versión 0.4.0-beta, firma del release con la clave debug y prueba de ráfaga de avisos</w:t>
+            </w:r>
+          </w:p>
+        </w:tc>
+      </w:tr>
+      <w:tr>
+        <w:trPr>
+          <w:cantSplit w:val="true"/>
+        </w:trPr>
+        <w:tc>
+          <w:tcPr>
+            <w:tcW w:type="dxa" w:w="1020"/>
+          </w:tcPr>
+          <w:p>
+            <w:pPr>
+              <w:spacing w:after="0"/>
+            </w:pPr>
+            <w:r/>
+            <w:r>
+              <w:rPr>
+                <w:b w:val="0"/>
+                <w:i w:val="0"/>
+                <w:sz w:val="16"/>
+              </w:rPr>
+              <w:t>a768e56</w:t>
+            </w:r>
+          </w:p>
+        </w:tc>
+        <w:tc>
+          <w:tcPr>
+            <w:tcW w:type="dxa" w:w="2041"/>
+          </w:tcPr>
+          <w:p>
+            <w:pPr>
+              <w:spacing w:after="0"/>
+            </w:pPr>
+            <w:r/>
+            <w:r>
+              <w:rPr>
+                <w:b w:val="0"/>
+                <w:i w:val="0"/>
+                <w:sz w:val="16"/>
+              </w:rPr>
+              <w:t>yaelrdf</w:t>
+            </w:r>
+          </w:p>
+        </w:tc>
+        <w:tc>
+          <w:tcPr>
+            <w:tcW w:type="dxa" w:w="1247"/>
+          </w:tcPr>
+          <w:p>
+            <w:pPr>
+              <w:spacing w:after="0"/>
+            </w:pPr>
+            <w:r/>
+            <w:r>
+              <w:rPr>
+                <w:b w:val="0"/>
+                <w:i w:val="0"/>
+                <w:sz w:val="16"/>
+              </w:rPr>
+              <w:t>2026-10-31</w:t>
+            </w:r>
+          </w:p>
+        </w:tc>
+        <w:tc>
+          <w:tcPr>
+            <w:tcW w:type="dxa" w:w="5329"/>
+          </w:tcPr>
+          <w:p>
+            <w:pPr>
+              <w:spacing w:after="0"/>
+            </w:pPr>
+            <w:r/>
+            <w:r>
+              <w:rPr>
+                <w:b w:val="0"/>
+                <w:i w:val="0"/>
+                <w:sz w:val="16"/>
+              </w:rPr>
+              <w:t>docs: notas de la versión 0.4.0-beta, ADR-007 y solicitud de usuario demo</w:t>
+            </w:r>
+          </w:p>
+        </w:tc>
+      </w:tr>
+      <w:tr>
+        <w:trPr>
+          <w:cantSplit w:val="true"/>
+        </w:trPr>
+        <w:tc>
+          <w:tcPr>
+            <w:tcW w:type="dxa" w:w="1020"/>
+            <w:shd w:val="clear" w:color="auto" w:fill="EEF2FF"/>
+          </w:tcPr>
+          <w:p>
+            <w:pPr>
+              <w:spacing w:after="0"/>
+            </w:pPr>
+            <w:r/>
+            <w:r>
+              <w:rPr>
+                <w:b w:val="0"/>
+                <w:i w:val="0"/>
+                <w:sz w:val="16"/>
+              </w:rPr>
+              <w:t>4c8360e</w:t>
+            </w:r>
+          </w:p>
+        </w:tc>
+        <w:tc>
+          <w:tcPr>
+            <w:tcW w:type="dxa" w:w="2041"/>
+            <w:shd w:val="clear" w:color="auto" w:fill="EEF2FF"/>
+          </w:tcPr>
+          <w:p>
+            <w:pPr>
+              <w:spacing w:after="0"/>
+            </w:pPr>
+            <w:r/>
+            <w:r>
+              <w:rPr>
+                <w:b w:val="0"/>
+                <w:i w:val="0"/>
+                <w:sz w:val="16"/>
+              </w:rPr>
+              <w:t>yaelrdf</w:t>
+            </w:r>
+          </w:p>
+        </w:tc>
+        <w:tc>
+          <w:tcPr>
+            <w:tcW w:type="dxa" w:w="1247"/>
+            <w:shd w:val="clear" w:color="auto" w:fill="EEF2FF"/>
+          </w:tcPr>
+          <w:p>
+            <w:pPr>
+              <w:spacing w:after="0"/>
+            </w:pPr>
+            <w:r/>
+            <w:r>
+              <w:rPr>
+                <w:b w:val="0"/>
+                <w:i w:val="0"/>
+                <w:sz w:val="16"/>
+              </w:rPr>
+              <w:t>2026-10-31</w:t>
+            </w:r>
+          </w:p>
+        </w:tc>
+        <w:tc>
+          <w:tcPr>
+            <w:tcW w:type="dxa" w:w="5329"/>
+            <w:shd w:val="clear" w:color="auto" w:fill="EEF2FF"/>
+          </w:tcPr>
+          <w:p>
+            <w:pPr>
+              <w:spacing w:after="0"/>
+            </w:pPr>
+            <w:r/>
+            <w:r>
+              <w:rPr>
+                <w:b w:val="0"/>
+                <w:i w:val="0"/>
+                <w:sz w:val="16"/>
+              </w:rPr>
+              <w:t>feat(ui): identidad V.I.S.O.R. y retiro del mapa asistido 2D</w:t>
+            </w:r>
+          </w:p>
+        </w:tc>
+      </w:tr>
+      <w:tr>
+        <w:trPr>
+          <w:cantSplit w:val="true"/>
+        </w:trPr>
+        <w:tc>
+          <w:tcPr>
+            <w:tcW w:type="dxa" w:w="1020"/>
+          </w:tcPr>
+          <w:p>
+            <w:pPr>
+              <w:spacing w:after="0"/>
+            </w:pPr>
+            <w:r/>
+            <w:r>
+              <w:rPr>
+                <w:b w:val="0"/>
+                <w:i w:val="0"/>
+                <w:sz w:val="16"/>
+              </w:rPr>
+              <w:t>eeb96d7</w:t>
+            </w:r>
+          </w:p>
+        </w:tc>
+        <w:tc>
+          <w:tcPr>
+            <w:tcW w:type="dxa" w:w="2041"/>
+          </w:tcPr>
+          <w:p>
+            <w:pPr>
+              <w:spacing w:after="0"/>
+            </w:pPr>
+            <w:r/>
+            <w:r>
+              <w:rPr>
+                <w:b w:val="0"/>
+                <w:i w:val="0"/>
+                <w:sz w:val="16"/>
+              </w:rPr>
+              <w:t>yaelrdf</w:t>
+            </w:r>
+          </w:p>
+        </w:tc>
+        <w:tc>
+          <w:tcPr>
+            <w:tcW w:type="dxa" w:w="1247"/>
+          </w:tcPr>
+          <w:p>
+            <w:pPr>
+              <w:spacing w:after="0"/>
+            </w:pPr>
+            <w:r/>
+            <w:r>
+              <w:rPr>
+                <w:b w:val="0"/>
+                <w:i w:val="0"/>
+                <w:sz w:val="16"/>
+              </w:rPr>
+              <w:t>2026-10-31</w:t>
+            </w:r>
+          </w:p>
+        </w:tc>
+        <w:tc>
+          <w:tcPr>
+            <w:tcW w:type="dxa" w:w="5329"/>
+          </w:tcPr>
+          <w:p>
+            <w:pPr>
+              <w:spacing w:after="0"/>
+            </w:pPr>
+            <w:r/>
+            <w:r>
+              <w:rPr>
+                <w:b w:val="0"/>
+                <w:i w:val="0"/>
+                <w:sz w:val="16"/>
+              </w:rPr>
+              <w:t>docs: ADR-008 (identidad V.I.S.O.R.), ADR-009 (mapa 2D fuera de versión) y ajustes de estado</w:t>
+            </w:r>
+          </w:p>
+        </w:tc>
+      </w:tr>
+      <w:tr>
+        <w:trPr>
+          <w:cantSplit w:val="true"/>
+        </w:trPr>
+        <w:tc>
+          <w:tcPr>
+            <w:tcW w:type="dxa" w:w="1020"/>
+            <w:shd w:val="clear" w:color="auto" w:fill="EEF2FF"/>
+          </w:tcPr>
+          <w:p>
+            <w:pPr>
+              <w:spacing w:after="0"/>
+            </w:pPr>
+            <w:r/>
+            <w:r>
+              <w:rPr>
+                <w:b w:val="0"/>
+                <w:i w:val="0"/>
+                <w:sz w:val="16"/>
+              </w:rPr>
+              <w:t>f1acae1</w:t>
+            </w:r>
+          </w:p>
+        </w:tc>
+        <w:tc>
+          <w:tcPr>
+            <w:tcW w:type="dxa" w:w="2041"/>
+            <w:shd w:val="clear" w:color="auto" w:fill="EEF2FF"/>
+          </w:tcPr>
+          <w:p>
+            <w:pPr>
+              <w:spacing w:after="0"/>
+            </w:pPr>
+            <w:r/>
+            <w:r>
+              <w:rPr>
+                <w:b w:val="0"/>
+                <w:i w:val="0"/>
+                <w:sz w:val="16"/>
+              </w:rPr>
+              <w:t>yaelrdf</w:t>
+            </w:r>
+          </w:p>
+        </w:tc>
+        <w:tc>
+          <w:tcPr>
+            <w:tcW w:type="dxa" w:w="1247"/>
+            <w:shd w:val="clear" w:color="auto" w:fill="EEF2FF"/>
+          </w:tcPr>
+          <w:p>
+            <w:pPr>
+              <w:spacing w:after="0"/>
+            </w:pPr>
+            <w:r/>
+            <w:r>
+              <w:rPr>
+                <w:b w:val="0"/>
+                <w:i w:val="0"/>
+                <w:sz w:val="16"/>
+              </w:rPr>
+              <w:t>2026-10-31</w:t>
+            </w:r>
+          </w:p>
+        </w:tc>
+        <w:tc>
+          <w:tcPr>
+            <w:tcW w:type="dxa" w:w="5329"/>
+            <w:shd w:val="clear" w:color="auto" w:fill="EEF2FF"/>
+          </w:tcPr>
+          <w:p>
+            <w:pPr>
+              <w:spacing w:after="0"/>
+            </w:pPr>
+            <w:r/>
+            <w:r>
+              <w:rPr>
+                <w:b w:val="0"/>
+                <w:i w:val="0"/>
+                <w:sz w:val="16"/>
+              </w:rPr>
+              <w:t>perf(build): R8 en release y demo; fix(ui): encabezado de Misiones y títulos de tarjeta</w:t>
+            </w:r>
+          </w:p>
+        </w:tc>
+      </w:tr>
     </w:tbl>
     <w:p>
       <w:pPr>
@@ -20865,7 +22264,7 @@
                 <w:i w:val="0"/>
                 <w:sz w:val="18"/>
               </w:rPr>
-              <w:t>10</w:t>
+              <w:t>22</w:t>
             </w:r>
           </w:p>
         </w:tc>
@@ -20910,7 +22309,7 @@
                 <w:i w:val="0"/>
                 <w:sz w:val="18"/>
               </w:rPr>
-              <w:t>yaelrdf (1), Yael RDF (1), José Carlos Bernal Bautista (6), Alejandro González Hernández (2)</w:t>
+              <w:t>yaelrdf (10), Yael RDF (1), José Carlos Bernal Bautista (6), Alejandro González Hernández (5)</w:t>
             </w:r>
           </w:p>
         </w:tc>
@@ -20953,7 +22352,7 @@
                 <w:i w:val="0"/>
                 <w:sz w:val="18"/>
               </w:rPr>
-              <w:t>101</w:t>
+              <w:t>103</w:t>
             </w:r>
           </w:p>
         </w:tc>
@@ -20998,7 +22397,7 @@
                 <w:i w:val="0"/>
                 <w:sz w:val="18"/>
               </w:rPr>
-              <w:t>15</w:t>
+              <w:t>16</w:t>
             </w:r>
           </w:p>
         </w:tc>
@@ -21041,7 +22440,7 @@
                 <w:i w:val="0"/>
                 <w:sz w:val="18"/>
               </w:rPr>
-              <w:t>10 633</w:t>
+              <w:t>10 940</w:t>
             </w:r>
           </w:p>
         </w:tc>
@@ -21322,7 +22721,42 @@
           <w:b w:val="0"/>
           <w:i w:val="0"/>
         </w:rPr>
-        <w:t xml:space="preserve"> 0.3.0-beta de lectura pública, documentación actualizada y este documento.</w:t>
+        <w:t xml:space="preserve"> de lectura pública (0.3.0-beta) y primera documentación en Word.</w:t>
+      </w:r>
+    </w:p>
+    <w:p>
+      <w:pPr>
+        <w:pStyle w:val="ListBullet"/>
+        <w:spacing w:after="40"/>
+      </w:pPr>
+      <w:r>
+        <w:rPr>
+          <w:b/>
+          <w:i w:val="0"/>
+        </w:rPr>
+        <w:t>30 y 31 de octubre:</w:t>
+      </w:r>
+      <w:r>
+        <w:rPr>
+          <w:b w:val="0"/>
+          <w:i w:val="0"/>
+        </w:rPr>
+        <w:t xml:space="preserve"> se integra la rama </w:t>
+      </w:r>
+      <w:r>
+        <w:rPr>
+          <w:rFonts w:ascii="Consolas" w:hAnsi="Consolas" w:eastAsia="Consolas"/>
+          <w:i w:val="0"/>
+          <w:sz w:val="19"/>
+        </w:rPr>
+        <w:t>dev</w:t>
+      </w:r>
+      <w:r>
+        <w:rPr>
+          <w:b w:val="0"/>
+          <w:i w:val="0"/>
+        </w:rPr>
+        <w:t xml:space="preserve"> (inicio de sesión, rediseño y optimización de memoria) y se publica la 0.4.0-beta con dos APK; identidad V.I.S.O.R., retiro del mapa 2D, R8 (el APK baja de 34.5 a 5.3 MB y la memoria de 121.6 a 92.5 MB), pruebas en un teléfono real, manual de usuario y la versión 0.5.0-beta.</w:t>
       </w:r>
     </w:p>
     <w:p>
@@ -21354,7 +22788,7 @@
           <w:b w:val="0"/>
           <w:i w:val="0"/>
         </w:rPr>
-        <w:t xml:space="preserve"> (0.3.0-beta-demo) permite mostrar la app con datos reales </w:t>
+        <w:t xml:space="preserve"> (0.5.0-beta-demo) permite mostrar la app con datos reales </w:t>
       </w:r>
       <w:r>
         <w:rPr>
@@ -21988,7 +23422,7 @@
           <w:b w:val="0"/>
           <w:i w:val="0"/>
         </w:rPr>
-        <w:t>Historial con 2 puntos; alertas y misiones vacías; mapa "pendiente de backend".</w:t>
+        <w:t>Historial con 2 puntos; alertas y misiones vacías; el mapa 2D dice "No disponible · Implementación futura".</w:t>
       </w:r>
     </w:p>
     <w:p>
@@ -22091,7 +23525,7 @@
                 <w:i w:val="0"/>
                 <w:sz w:val="18"/>
               </w:rPr>
-              <w:t>Archivo</w:t>
+              <w:t>APK con inicio de sesión</w:t>
             </w:r>
           </w:p>
         </w:tc>
@@ -22110,7 +23544,7 @@
                 <w:i w:val="0"/>
                 <w:sz w:val="18"/>
               </w:rPr>
-              <w:t>RobotCentinela-0.3.0-beta-demo.apk</w:t>
+              <w:t>RobotCentinela-0.5.0-beta.apk · 5.3 MB · SHA-256 cb0ead36ba1303acf37c47352425c3fd0dc1c5c86ac9fe9bf4e3b474ab757afd</w:t>
             </w:r>
           </w:p>
         </w:tc>
@@ -22135,7 +23569,7 @@
                 <w:i w:val="0"/>
                 <w:sz w:val="18"/>
               </w:rPr>
-              <w:t>Identificador</w:t>
+              <w:t>APK de demostración</w:t>
             </w:r>
           </w:p>
         </w:tc>
@@ -22155,7 +23589,7 @@
                 <w:i w:val="0"/>
                 <w:sz w:val="18"/>
               </w:rPr>
-              <w:t>com.robotcentinela.app</w:t>
+              <w:t>RobotCentinela-0.5.0-beta-demo.apk · 5.3 MB · SHA-256 8db0d98a6acfafb69968bbf2f478f88a9a2a04a5d5e01e14e2e5dce203a7ff30</w:t>
             </w:r>
           </w:p>
         </w:tc>
@@ -22179,7 +23613,7 @@
                 <w:i w:val="0"/>
                 <w:sz w:val="18"/>
               </w:rPr>
-              <w:t>versionName / versionCode</w:t>
+              <w:t>Paquete</w:t>
             </w:r>
           </w:p>
         </w:tc>
@@ -22198,7 +23632,7 @@
                 <w:i w:val="0"/>
                 <w:sz w:val="18"/>
               </w:rPr>
-              <w:t>0.3.0-beta-demo / 2</w:t>
+              <w:t>com.robotcentinela.app · versionCode 4 · minSdk 29 · targetSdk 36</w:t>
             </w:r>
           </w:p>
         </w:tc>
@@ -22223,7 +23657,7 @@
                 <w:i w:val="0"/>
                 <w:sz w:val="18"/>
               </w:rPr>
-              <w:t>Android</w:t>
+              <w:t>Firma</w:t>
             </w:r>
           </w:p>
         </w:tc>
@@ -22243,7 +23677,7 @@
                 <w:i w:val="0"/>
                 <w:sz w:val="18"/>
               </w:rPr>
-              <w:t>10 o superior (minSdk 29), targetSdk 36</w:t>
+              <w:t>Clave de depuración de Android (CN=Android Debug); no apta para tiendas</w:t>
             </w:r>
           </w:p>
         </w:tc>
@@ -22267,7 +23701,7 @@
                 <w:i w:val="0"/>
                 <w:sz w:val="18"/>
               </w:rPr>
-              <w:t>Tamaño</w:t>
+              <w:t>R8</w:t>
             </w:r>
           </w:p>
         </w:tc>
@@ -22286,140 +23720,7 @@
                 <w:i w:val="0"/>
                 <w:sz w:val="18"/>
               </w:rPr>
-              <w:t>unos 34 MB</w:t>
-            </w:r>
-          </w:p>
-        </w:tc>
-      </w:tr>
-      <w:tr>
-        <w:trPr>
-          <w:cantSplit w:val="true"/>
-        </w:trPr>
-        <w:tc>
-          <w:tcPr>
-            <w:tcW w:type="dxa" w:w="2551"/>
-            <w:shd w:val="clear" w:color="auto" w:fill="EEF2FF"/>
-          </w:tcPr>
-          <w:p>
-            <w:pPr>
-              <w:spacing w:after="0"/>
-            </w:pPr>
-            <w:r/>
-            <w:r>
-              <w:rPr>
-                <w:b w:val="0"/>
-                <w:i w:val="0"/>
-                <w:sz w:val="18"/>
-              </w:rPr>
-              <w:t>SHA-256</w:t>
-            </w:r>
-          </w:p>
-        </w:tc>
-        <w:tc>
-          <w:tcPr>
-            <w:tcW w:type="dxa" w:w="7087"/>
-            <w:shd w:val="clear" w:color="auto" w:fill="EEF2FF"/>
-          </w:tcPr>
-          <w:p>
-            <w:pPr>
-              <w:spacing w:after="0"/>
-            </w:pPr>
-            <w:r/>
-            <w:r>
-              <w:rPr>
-                <w:b w:val="0"/>
-                <w:i w:val="0"/>
-                <w:sz w:val="18"/>
-              </w:rPr>
-              <w:t>2199ddd7b8b86d263b762ef2b25b2be7c724093601c73d0b97a0bff31bab91f2</w:t>
-            </w:r>
-          </w:p>
-        </w:tc>
-      </w:tr>
-      <w:tr>
-        <w:trPr>
-          <w:cantSplit w:val="true"/>
-        </w:trPr>
-        <w:tc>
-          <w:tcPr>
-            <w:tcW w:type="dxa" w:w="2551"/>
-          </w:tcPr>
-          <w:p>
-            <w:pPr>
-              <w:spacing w:after="0"/>
-            </w:pPr>
-            <w:r/>
-            <w:r>
-              <w:rPr>
-                <w:b w:val="0"/>
-                <w:i w:val="0"/>
-                <w:sz w:val="18"/>
-              </w:rPr>
-              <w:t>Firma</w:t>
-            </w:r>
-          </w:p>
-        </w:tc>
-        <w:tc>
-          <w:tcPr>
-            <w:tcW w:type="dxa" w:w="7087"/>
-          </w:tcPr>
-          <w:p>
-            <w:pPr>
-              <w:spacing w:after="0"/>
-            </w:pPr>
-            <w:r/>
-            <w:r>
-              <w:rPr>
-                <w:b w:val="0"/>
-                <w:i w:val="0"/>
-                <w:sz w:val="18"/>
-              </w:rPr>
-              <w:t>Android Debug (esquema v2); no apta para publicar</w:t>
-            </w:r>
-          </w:p>
-        </w:tc>
-      </w:tr>
-      <w:tr>
-        <w:trPr>
-          <w:cantSplit w:val="true"/>
-        </w:trPr>
-        <w:tc>
-          <w:tcPr>
-            <w:tcW w:type="dxa" w:w="2551"/>
-            <w:shd w:val="clear" w:color="auto" w:fill="EEF2FF"/>
-          </w:tcPr>
-          <w:p>
-            <w:pPr>
-              <w:spacing w:after="0"/>
-            </w:pPr>
-            <w:r/>
-            <w:r>
-              <w:rPr>
-                <w:b w:val="0"/>
-                <w:i w:val="0"/>
-                <w:sz w:val="18"/>
-              </w:rPr>
-              <w:t>Verificado</w:t>
-            </w:r>
-          </w:p>
-        </w:tc>
-        <w:tc>
-          <w:tcPr>
-            <w:tcW w:type="dxa" w:w="7087"/>
-            <w:shd w:val="clear" w:color="auto" w:fill="EEF2FF"/>
-          </w:tcPr>
-          <w:p>
-            <w:pPr>
-              <w:spacing w:after="0"/>
-            </w:pPr>
-            <w:r/>
-            <w:r>
-              <w:rPr>
-                <w:b w:val="0"/>
-                <w:i w:val="0"/>
-                <w:sz w:val="18"/>
-              </w:rPr>
-              <w:t>manifiesto, firma, BuildConfig y contenido; no se ejecutó en dispositivo</w:t>
+              <w:t>Activado en release y demo (el APK sin minificar pesaba 34.5 MB)</w:t>
             </w:r>
           </w:p>
         </w:tc>
@@ -22473,7 +23774,7 @@
                 <w:i w:val="0"/>
                 <w:sz w:val="20"/>
               </w:rPr>
-              <w:t xml:space="preserve"> Si backend aplica las políticas de lectura por membresía o cierra la lectura anónima (B19), el APK deja de mostrar datos. Es el comportamiento correcto y no debe revertirse. Se retira al existir el usuario de pruebas o el inicio de sesión.</w:t>
+              <w:t xml:space="preserve"> Si backend aplica las políticas de lectura por membresía o cierra la lectura anónima (B19), el APK deja de mostrar datos. Es el comportamiento correcto y no debe revertirse. Se retira al existir el usuario de pruebas con membresía (B21).</w:t>
             </w:r>
           </w:p>
         </w:tc>
@@ -24160,7 +25461,7 @@
                 <w:i w:val="0"/>
                 <w:sz w:val="15"/>
               </w:rPr>
-              <w:t>En el proyecto de Supabase (revisado el 23 de octubre de 2026), sin iniciar sesión y solo con la clave pública se leen homes, robots, devices, channels, map_versions, telemetry_frames, sensor_readings, frame_poses, robot_states y battery_readings. Cualquiera con la app (la clave pública va dentro del APK) puede leer la telemetría. Revisado de nuevo el 29 de octubre de 2026: sigue abierto (10 tablas legibles sin sesión). La demo beta depende de esto (ADR-006)</w:t>
+              <w:t>En el proyecto de Supabase (revisado el 23 de octubre de 2026), sin iniciar sesión y solo con la clave pública se leen homes, robots, devices, channels, map_versions, telemetry_frames, sensor_readings, frame_poses, robot_states y battery_readings. Cualquiera con la app (la clave pública va dentro del APK) puede leer la telemetría. Revisado de nuevo el 29 de octubre de 2026: sigue abierto (10 tablas legibles sin sesión). La demo beta depende de esto (ADR-007)</w:t>
             </w:r>
           </w:p>
         </w:tc>
@@ -24345,7 +25646,7 @@
                 <w:i w:val="0"/>
                 <w:sz w:val="15"/>
               </w:rPr>
-              <w:t>Sin él la app se queda en "Sin sesión". El build demo no lo necesita (ADR-006)</w:t>
+              <w:t>Sin él, el inicio de sesión funciona pero no se ve ningún domicilio. El build demo no lo necesita (ADR-007). Solicitud lista para backend: solicitud-usuario-demo.md</w:t>
             </w:r>
           </w:p>
         </w:tc>
@@ -24688,7 +25989,7 @@
                 <w:i w:val="0"/>
                 <w:sz w:val="16"/>
               </w:rPr>
-              <w:t>Correo y contraseña, porque RF01 pide "recuperar acceso". Mientras no exista la pantalla de login (va al final), los builds debug entran con una cuenta de prueba de local.properties (DevAccount.kt)</w:t>
+              <w:t>Resuelto: Autenticación por correo y contraseña implementada con LoginScreen, SignIn, SignOut y RecoverAccess. Las compilaciones debug conservan botón para autocompletar la cuenta de prueba de local.properties (DevAccount.kt). Código: LoginScreen.kt, LoginViewModel.kt, RootViewModel.kt</w:t>
             </w:r>
           </w:p>
         </w:tc>
@@ -25323,7 +26624,7 @@
                 <w:i w:val="0"/>
                 <w:sz w:val="16"/>
               </w:rPr>
-              <w:t>Requieren que el backend asigne lecturas con el plano validado (RB11); la app no lo hace</w:t>
+              <w:t>Dependen del mapa 2D: la app muestra "No disponible / Implementación futura" (ADR-009)</w:t>
             </w:r>
           </w:p>
         </w:tc>
@@ -25388,7 +26689,7 @@
                 <w:i w:val="0"/>
                 <w:sz w:val="16"/>
               </w:rPr>
-              <w:t>Sin ícono propio hasta que el equipo lo defina</w:t>
+              <w:t>Resuelto con el Manual de identidad corporativa (ADR-008): isotipo V.I.S.O.R., ícono adaptativo y pantalla de bienvenida. Los activos se vectorizaron desde imágenes del PDF; conviene reemplazarlos por los SVG originales del equipo de diseño</w:t>
             </w:r>
           </w:p>
         </w:tc>
@@ -25450,7 +26751,7 @@
                 <w:i w:val="0"/>
                 <w:sz w:val="16"/>
               </w:rPr>
-              <w:t>Pendiente por indicación del equipo. Al existir, se retira el build demo y sus adaptadores PublicRead* (ADR-006)</w:t>
+              <w:t>Resuelto en dev (LoginScreen, ADR-006). El build demo se conserva hasta que exista el usuario de pruebas con membresía (B21); entonces se retira junto con los adaptadores PublicRead* (ADR-007)</w:t>
             </w:r>
           </w:p>
         </w:tc>
@@ -25771,7 +27072,7 @@
           <w:b w:val="0"/>
           <w:i w:val="0"/>
         </w:rPr>
-        <w:t xml:space="preserve"> (HU05, HU19, RF11, RF32): formato de </w:t>
+        <w:t xml:space="preserve"> (HU05, HU19, RF11, RF32): fuera de esta versión (ADR-009). Cuando IoT los publique: formato de </w:t>
       </w:r>
       <w:r>
         <w:rPr>
@@ -26224,7 +27525,7 @@
                 <w:i w:val="0"/>
                 <w:sz w:val="17"/>
               </w:rPr>
-              <w:t>ADR-006; migrar al usuario de pruebas o al login</w:t>
+              <w:t>ADR-007; migrar al usuario de pruebas con membresía (B21)</w:t>
             </w:r>
           </w:p>
         </w:tc>
@@ -26375,7 +27676,7 @@
                 <w:i w:val="0"/>
                 <w:sz w:val="17"/>
               </w:rPr>
-              <w:t>Contratos de mapas y misiones sin publicar</w:t>
+              <w:t>Misiones ampliadas y calibraciones sin publicar; mapa 2D fuera de versión</w:t>
             </w:r>
           </w:p>
         </w:tc>
@@ -26413,7 +27714,7 @@
                 <w:i w:val="0"/>
                 <w:sz w:val="17"/>
               </w:rPr>
-              <w:t>La UI muestra "pendiente de backend" sin inventar datos</w:t>
+              <w:t>La UI muestra "pendiente de backend" o "No disponible · Implementación futura" sin inventar datos</w:t>
             </w:r>
           </w:p>
         </w:tc>
@@ -26806,7 +28107,19 @@
                 <w:rFonts w:ascii="Consolas" w:hAnsi="Consolas" w:eastAsia="Consolas"/>
                 <w:sz w:val="18"/>
               </w:rPr>
-              <w:t>./gradlew assembleDebug            # APK de depuración (entra con la cuenta de prueba)</w:t>
+              <w:t>./gradlew assembleDebug            # APK de depuración (inicio de sesión con botón de cuenta de prueba)</w:t>
+            </w:r>
+          </w:p>
+          <w:p>
+            <w:pPr>
+              <w:spacing w:after="0"/>
+            </w:pPr>
+            <w:r>
+              <w:rPr>
+                <w:rFonts w:ascii="Consolas" w:hAnsi="Consolas" w:eastAsia="Consolas"/>
+                <w:sz w:val="18"/>
+              </w:rPr>
+              <w:t>./gradlew :app:assembleRelease     # APK con inicio de sesión (R8, firmado con la clave de depuración)</w:t>
             </w:r>
           </w:p>
           <w:p>
@@ -26858,7 +28171,7 @@
         <w:pStyle w:val="Heading2"/>
       </w:pPr>
       <w:r>
-        <w:t>15.4 Instalación del APK de demostración</w:t>
+        <w:t>15.4 Instalación del APK</w:t>
       </w:r>
     </w:p>
     <w:p>
@@ -26871,7 +28184,7 @@
           <w:b w:val="0"/>
           <w:i w:val="0"/>
         </w:rPr>
-        <w:t xml:space="preserve">1. Copiar </w:t>
+        <w:t xml:space="preserve">1. Copiar el APK al teléfono (Android 10 o superior): </w:t>
       </w:r>
       <w:r>
         <w:rPr>
@@ -26879,14 +28192,29 @@
           <w:i w:val="0"/>
           <w:sz w:val="19"/>
         </w:rPr>
-        <w:t>app-demo.apk</w:t>
+        <w:t>...-beta.apk</w:t>
       </w:r>
       <w:r>
         <w:rPr>
           <w:b w:val="0"/>
           <w:i w:val="0"/>
         </w:rPr>
-        <w:t xml:space="preserve"> al teléfono (Android 10 o superior).</w:t>
+        <w:t xml:space="preserve"> (con inicio de sesión) o </w:t>
+      </w:r>
+      <w:r>
+        <w:rPr>
+          <w:rFonts w:ascii="Consolas" w:hAnsi="Consolas" w:eastAsia="Consolas"/>
+          <w:i w:val="0"/>
+          <w:sz w:val="19"/>
+        </w:rPr>
+        <w:t>...-beta-demo.apk</w:t>
+      </w:r>
+      <w:r>
+        <w:rPr>
+          <w:b w:val="0"/>
+          <w:i w:val="0"/>
+        </w:rPr>
+        <w:t xml:space="preserve"> (demostración).</w:t>
       </w:r>
     </w:p>
     <w:p>
@@ -26912,7 +28240,7 @@
           <w:b w:val="0"/>
           <w:i w:val="0"/>
         </w:rPr>
-        <w:t>3. Abrir "Robot Centinela": la app entra sola y muestra el domicilio disponible.</w:t>
+        <w:t>3. Abrir "V.I.S.O.R.": la demostración entra sola y muestra el domicilio disponible; la versión con inicio de sesión pide una cuenta.</w:t>
       </w:r>
     </w:p>
     <w:p>
@@ -27194,7 +28522,7 @@
                 <w:i w:val="0"/>
                 <w:sz w:val="18"/>
               </w:rPr>
-              <w:t>:core (dominio y casos de uso)</w:t>
+              <w:t>:core</w:t>
             </w:r>
           </w:p>
         </w:tc>
@@ -27276,7 +28604,7 @@
                 <w:i w:val="0"/>
                 <w:sz w:val="18"/>
               </w:rPr>
-              <w:t>:app (adaptadores e interfaz)</w:t>
+              <w:t>:app</w:t>
             </w:r>
           </w:p>
         </w:tc>
@@ -27602,7 +28930,7 @@
                 <w:i w:val="0"/>
                 <w:sz w:val="18"/>
               </w:rPr>
-              <w:t xml:space="preserve">Pantalla de inicio de sesión y recuperación de acceso (RF01); retirar el build </w:t>
+              <w:t xml:space="preserve">Retirar el build </w:t>
             </w:r>
             <w:r>
               <w:rPr>
@@ -27611,6 +28939,14 @@
                 <w:sz w:val="16"/>
               </w:rPr>
               <w:t>demo</w:t>
+            </w:r>
+            <w:r>
+              <w:rPr>
+                <w:b w:val="0"/>
+                <w:i w:val="0"/>
+                <w:sz w:val="18"/>
+              </w:rPr>
+              <w:t xml:space="preserve"> cuando exista el usuario de pruebas con membresía</w:t>
             </w:r>
           </w:p>
         </w:tc>
@@ -27674,7 +29010,7 @@
                 <w:i w:val="0"/>
                 <w:sz w:val="18"/>
               </w:rPr>
-              <w:t>Contrato de mapas: plano, habitaciones y estaciones (HU05, HU19)</w:t>
+              <w:t>Mapa asistido 2D: plano, habitaciones y estaciones (HU05, HU19), hoy "No disponible"</w:t>
             </w:r>
           </w:p>
         </w:tc>
@@ -27694,7 +29030,7 @@
                 <w:i w:val="0"/>
                 <w:sz w:val="18"/>
               </w:rPr>
-              <w:t>Backend e IoT</w:t>
+              <w:t>IoT y backend</w:t>
             </w:r>
           </w:p>
         </w:tc>
@@ -27991,7 +29327,7 @@
                 <w:i w:val="0"/>
                 <w:sz w:val="18"/>
               </w:rPr>
-              <w:t>Logo, ícono propio y firma de release con keystore del equipo</w:t>
+              <w:t>SVG originales de la marca y firma de release con keystore del equipo</w:t>
             </w:r>
           </w:p>
         </w:tc>
@@ -28110,7 +29446,7 @@
                 <w:rFonts w:ascii="Consolas" w:hAnsi="Consolas" w:eastAsia="Consolas"/>
                 <w:sz w:val="18"/>
               </w:rPr>
-              <w:t xml:space="preserve">  homemapping/              pose, versión de mapa, plano (provisional)</w:t>
+              <w:t xml:space="preserve">  homemapping/              pose, versión de mapa, identificador de estación</w:t>
             </w:r>
           </w:p>
           <w:p>
@@ -28856,7 +30192,7 @@
         <w:color w:val="556070"/>
         <w:sz w:val="17"/>
       </w:rPr>
-      <w:t xml:space="preserve">Robot Centinela – Aplicación móvil · versión 0.3.0-beta · página </w:t>
+      <w:t xml:space="preserve">V.I.S.O.R. – Aplicación móvil · versión 0.5.0-beta · página </w:t>
     </w:r>
     <w:r>
       <w:rPr>

</xml_diff>